<commit_message>
Homework and File Management
Moved some files from local pc to remote repo
worked on Networks lab
</commit_message>
<xml_diff>
--- a/Semester 7 Fall 2026/Advanced Networks/Labs/Lab3/03_-_Subnetting.docx
+++ b/Semester 7 Fall 2026/Advanced Networks/Labs/Lab3/03_-_Subnetting.docx
@@ -1,6 +1,6 @@
 
 <file path=word/document.xml><?xml version="1.0" encoding="utf-8"?>
-<w:document xmlns:wpc="http://schemas.microsoft.com/office/word/2010/wordprocessingCanvas" xmlns:cx="http://schemas.microsoft.com/office/drawing/2014/chartex" xmlns:cx1="http://schemas.microsoft.com/office/drawing/2015/9/8/chartex" xmlns:cx2="http://schemas.microsoft.com/office/drawing/2015/10/21/chartex" xmlns:cx3="http://schemas.microsoft.com/office/drawing/2016/5/9/chartex" xmlns:cx4="http://schemas.microsoft.com/office/drawing/2016/5/10/chartex" xmlns:cx5="http://schemas.microsoft.com/office/drawing/2016/5/11/chartex" xmlns:cx6="http://schemas.microsoft.com/office/drawing/2016/5/12/chartex" xmlns:cx7="http://schemas.microsoft.com/office/drawing/2016/5/13/chartex" xmlns:cx8="http://schemas.microsoft.com/office/drawing/2016/5/14/chartex" xmlns:mc="http://schemas.openxmlformats.org/markup-compatibility/2006" xmlns:aink="http://schemas.microsoft.com/office/drawing/2016/ink" xmlns:am3d="http://schemas.microsoft.com/office/drawing/2017/model3d" xmlns:o="urn:schemas-microsoft-com:office:office" xmlns:oel="http://schemas.microsoft.com/office/2019/extlst" xmlns:r="http://schemas.openxmlformats.org/officeDocument/2006/relationships" xmlns:m="http://schemas.openxmlformats.org/officeDocument/2006/math" xmlns:v="urn:schemas-microsoft-com:vml" xmlns:wp14="http://schemas.microsoft.com/office/word/2010/wordprocessingDrawing" xmlns:wp="http://schemas.openxmlformats.org/drawingml/2006/wordprocessingDrawing" xmlns:w10="urn:schemas-microsoft-com:office:word" xmlns:w="http://schemas.openxmlformats.org/wordprocessingml/2006/main" xmlns:w14="http://schemas.microsoft.com/office/word/2010/wordml" xmlns:w15="http://schemas.microsoft.com/office/word/2012/wordml" xmlns:w16cex="http://schemas.microsoft.com/office/word/2018/wordml/cex" xmlns:w16cid="http://schemas.microsoft.com/office/word/2016/wordml/cid" xmlns:w16="http://schemas.microsoft.com/office/word/2018/wordml" xmlns:w16sdtdh="http://schemas.microsoft.com/office/word/2020/wordml/sdtdatahash" xmlns:w16se="http://schemas.microsoft.com/office/word/2015/wordml/symex" xmlns:wpg="http://schemas.microsoft.com/office/word/2010/wordprocessingGroup" xmlns:wpi="http://schemas.microsoft.com/office/word/2010/wordprocessingInk" xmlns:wne="http://schemas.microsoft.com/office/word/2006/wordml" xmlns:wps="http://schemas.microsoft.com/office/word/2010/wordprocessingShape" mc:Ignorable="w14 w15 w16se w16cid w16 w16cex w16sdtdh wp14">
+<w:document xmlns:wpc="http://schemas.microsoft.com/office/word/2010/wordprocessingCanvas" xmlns:cx="http://schemas.microsoft.com/office/drawing/2014/chartex" xmlns:cx1="http://schemas.microsoft.com/office/drawing/2015/9/8/chartex" xmlns:cx2="http://schemas.microsoft.com/office/drawing/2015/10/21/chartex" xmlns:cx3="http://schemas.microsoft.com/office/drawing/2016/5/9/chartex" xmlns:cx4="http://schemas.microsoft.com/office/drawing/2016/5/10/chartex" xmlns:cx5="http://schemas.microsoft.com/office/drawing/2016/5/11/chartex" xmlns:cx6="http://schemas.microsoft.com/office/drawing/2016/5/12/chartex" xmlns:cx7="http://schemas.microsoft.com/office/drawing/2016/5/13/chartex" xmlns:cx8="http://schemas.microsoft.com/office/drawing/2016/5/14/chartex" xmlns:mc="http://schemas.openxmlformats.org/markup-compatibility/2006" xmlns:aink="http://schemas.microsoft.com/office/drawing/2016/ink" xmlns:am3d="http://schemas.microsoft.com/office/drawing/2017/model3d" xmlns:o="urn:schemas-microsoft-com:office:office" xmlns:oel="http://schemas.microsoft.com/office/2019/extlst" xmlns:r="http://schemas.openxmlformats.org/officeDocument/2006/relationships" xmlns:m="http://schemas.openxmlformats.org/officeDocument/2006/math" xmlns:v="urn:schemas-microsoft-com:vml" xmlns:wp14="http://schemas.microsoft.com/office/word/2010/wordprocessingDrawing" xmlns:wp="http://schemas.openxmlformats.org/drawingml/2006/wordprocessingDrawing" xmlns:w10="urn:schemas-microsoft-com:office:word" xmlns:w="http://schemas.openxmlformats.org/wordprocessingml/2006/main" xmlns:w14="http://schemas.microsoft.com/office/word/2010/wordml" xmlns:w15="http://schemas.microsoft.com/office/word/2012/wordml" xmlns:w16cex="http://schemas.microsoft.com/office/word/2018/wordml/cex" xmlns:w16cid="http://schemas.microsoft.com/office/word/2016/wordml/cid" xmlns:w16="http://schemas.microsoft.com/office/word/2018/wordml" xmlns:w16du="http://schemas.microsoft.com/office/word/2023/wordml/word16du" xmlns:w16sdtdh="http://schemas.microsoft.com/office/word/2020/wordml/sdtdatahash" xmlns:w16sdtfl="http://schemas.microsoft.com/office/word/2024/wordml/sdtformatlock" xmlns:w16se="http://schemas.microsoft.com/office/word/2015/wordml/symex" xmlns:wpg="http://schemas.microsoft.com/office/word/2010/wordprocessingGroup" xmlns:wpi="http://schemas.microsoft.com/office/word/2010/wordprocessingInk" xmlns:wne="http://schemas.microsoft.com/office/word/2006/wordml" xmlns:wps="http://schemas.microsoft.com/office/word/2010/wordprocessingShape" mc:Ignorable="w14 w15 w16se w16cid w16 w16cex w16sdtdh w16sdtfl w16du wp14">
   <w:body>
     <w:p>
       <w:pPr>
@@ -31,23 +31,7 @@
           <w:szCs w:val="24"/>
         </w:rPr>
         <w:br/>
-        <w:t xml:space="preserve">Teacher: Tiago </w:t>
-      </w:r>
-      <w:proofErr w:type="spellStart"/>
-      <w:r>
-        <w:rPr>
-          <w:sz w:val="24"/>
-          <w:szCs w:val="24"/>
-        </w:rPr>
-        <w:t>Bortoletto</w:t>
-      </w:r>
-      <w:proofErr w:type="spellEnd"/>
-      <w:r>
-        <w:rPr>
-          <w:sz w:val="24"/>
-          <w:szCs w:val="24"/>
-        </w:rPr>
-        <w:t xml:space="preserve"> Vaz</w:t>
+        <w:t>Teacher: Tiago Bortoletto Vaz</w:t>
       </w:r>
     </w:p>
     <w:p>
@@ -134,15 +118,7 @@
         <w:ind w:left="360"/>
       </w:pPr>
       <w:r>
-        <w:t xml:space="preserve">•  Recommended router: Cisco 2911 (3 onboard </w:t>
-      </w:r>
-      <w:proofErr w:type="spellStart"/>
-      <w:r>
-        <w:t>GigabitEthernet</w:t>
-      </w:r>
-      <w:proofErr w:type="spellEnd"/>
-      <w:r>
-        <w:t xml:space="preserve"> ports covers the 3 departments). For the 4th interface (WAN link), power the router off, add an HWIC-1GE-SFP in an empty HWIC slot, seat a GLC-LH-SMD in its SFP cage, then power back on.</w:t>
+        <w:t>•  Recommended router: Cisco 2911 (3 onboard GigabitEthernet ports covers the 3 departments). For the 4th interface (WAN link), power the router off, add an HWIC-1GE-SFP in an empty HWIC slot, seat a GLC-LH-SMD in its SFP cage, then power back on.</w:t>
       </w:r>
     </w:p>
     <w:p>
@@ -924,10 +900,7 @@
           </w:tcPr>
           <w:p>
             <w:r>
-              <w:t>192.168.10.6</w:t>
-            </w:r>
-            <w:r>
-              <w:t>3</w:t>
+              <w:t>192.168.10.63</w:t>
             </w:r>
           </w:p>
         </w:tc>
@@ -984,10 +957,7 @@
           </w:tcPr>
           <w:p>
             <w:r>
-              <w:t>192.168.10.</w:t>
-            </w:r>
-            <w:r>
-              <w:t>64</w:t>
+              <w:t>192.168.10.64</w:t>
             </w:r>
           </w:p>
         </w:tc>
@@ -1035,10 +1005,7 @@
           </w:tcPr>
           <w:p>
             <w:r>
-              <w:t>192.168.10.</w:t>
-            </w:r>
-            <w:r>
-              <w:t>65</w:t>
+              <w:t>192.168.10.65</w:t>
             </w:r>
           </w:p>
         </w:tc>
@@ -1054,10 +1021,7 @@
           </w:tcPr>
           <w:p>
             <w:r>
-              <w:t>192.168.10.</w:t>
-            </w:r>
-            <w:r>
-              <w:t>94</w:t>
+              <w:t>192.168.10.94</w:t>
             </w:r>
           </w:p>
         </w:tc>
@@ -1073,10 +1037,7 @@
           </w:tcPr>
           <w:p>
             <w:r>
-              <w:t>192.168.10.</w:t>
-            </w:r>
-            <w:r>
-              <w:t>95</w:t>
+              <w:t>192.168.10.95</w:t>
             </w:r>
           </w:p>
         </w:tc>
@@ -1132,10 +1093,7 @@
           </w:tcPr>
           <w:p>
             <w:r>
-              <w:t>192.168.10.</w:t>
-            </w:r>
-            <w:r>
-              <w:t>96</w:t>
+              <w:t>192.168.10.96</w:t>
             </w:r>
           </w:p>
         </w:tc>
@@ -1183,10 +1141,7 @@
           </w:tcPr>
           <w:p>
             <w:r>
-              <w:t>192.168.10.</w:t>
-            </w:r>
-            <w:r>
-              <w:t>97</w:t>
+              <w:t>192.168.10.97</w:t>
             </w:r>
           </w:p>
         </w:tc>
@@ -1202,10 +1157,7 @@
           </w:tcPr>
           <w:p>
             <w:r>
-              <w:t>192.168.10.</w:t>
-            </w:r>
-            <w:r>
-              <w:t>110</w:t>
+              <w:t>192.168.10.110</w:t>
             </w:r>
           </w:p>
         </w:tc>
@@ -1221,10 +1173,7 @@
           </w:tcPr>
           <w:p>
             <w:r>
-              <w:t>192.168.10.</w:t>
-            </w:r>
-            <w:r>
-              <w:t>111</w:t>
+              <w:t>192.168.10.111</w:t>
             </w:r>
           </w:p>
         </w:tc>
@@ -1280,10 +1229,7 @@
           </w:tcPr>
           <w:p>
             <w:r>
-              <w:t>192.168.10.</w:t>
-            </w:r>
-            <w:r>
-              <w:t>112</w:t>
+              <w:t>192.168.10.112</w:t>
             </w:r>
           </w:p>
         </w:tc>
@@ -1331,10 +1277,7 @@
           </w:tcPr>
           <w:p>
             <w:r>
-              <w:t>192.168.10.1</w:t>
-            </w:r>
-            <w:r>
-              <w:t>13</w:t>
+              <w:t>192.168.10.113</w:t>
             </w:r>
           </w:p>
         </w:tc>
@@ -1350,10 +1293,7 @@
           </w:tcPr>
           <w:p>
             <w:r>
-              <w:t>192.168.10.1</w:t>
-            </w:r>
-            <w:r>
-              <w:t>18</w:t>
+              <w:t>192.168.10.118</w:t>
             </w:r>
           </w:p>
         </w:tc>
@@ -1369,10 +1309,7 @@
           </w:tcPr>
           <w:p>
             <w:r>
-              <w:t>192.168.10.</w:t>
-            </w:r>
-            <w:r>
-              <w:t>119</w:t>
+              <w:t>192.168.10.119</w:t>
             </w:r>
           </w:p>
         </w:tc>
@@ -1428,10 +1365,7 @@
           </w:tcPr>
           <w:p>
             <w:r>
-              <w:t>192.168.10.</w:t>
-            </w:r>
-            <w:r>
-              <w:t>120</w:t>
+              <w:t>192.168.10.120</w:t>
             </w:r>
           </w:p>
         </w:tc>
@@ -1479,10 +1413,7 @@
           </w:tcPr>
           <w:p>
             <w:r>
-              <w:t>192.168.10.1</w:t>
-            </w:r>
-            <w:r>
-              <w:t>21</w:t>
+              <w:t>192.168.10.121</w:t>
             </w:r>
           </w:p>
         </w:tc>
@@ -1498,10 +1429,7 @@
           </w:tcPr>
           <w:p>
             <w:r>
-              <w:t>192.168.10.1</w:t>
-            </w:r>
-            <w:r>
-              <w:t>22</w:t>
+              <w:t>192.168.10.122</w:t>
             </w:r>
           </w:p>
         </w:tc>
@@ -1517,10 +1445,7 @@
           </w:tcPr>
           <w:p>
             <w:r>
-              <w:t>192.168.10.</w:t>
-            </w:r>
-            <w:r>
-              <w:t>123</w:t>
+              <w:t>192.168.10.123</w:t>
             </w:r>
           </w:p>
         </w:tc>
@@ -1683,7 +1608,10 @@
           </w:tcPr>
           <w:p>
             <w:r>
-              <w:t>192.168.10.0</w:t>
+              <w:t>192.168.10.</w:t>
+            </w:r>
+            <w:r>
+              <w:t>1</w:t>
             </w:r>
           </w:p>
         </w:tc>
@@ -1737,10 +1665,10 @@
           </w:tcPr>
           <w:p>
             <w:r>
-              <w:t>192.168.10.</w:t>
-            </w:r>
-            <w:r>
-              <w:t>64</w:t>
+              <w:t>192.168.10.6</w:t>
+            </w:r>
+            <w:r>
+              <w:t>5</w:t>
             </w:r>
           </w:p>
         </w:tc>
@@ -1794,10 +1722,10 @@
           </w:tcPr>
           <w:p>
             <w:r>
-              <w:t>192.168.10.</w:t>
-            </w:r>
-            <w:r>
-              <w:t>96</w:t>
+              <w:t>192.168.10.9</w:t>
+            </w:r>
+            <w:r>
+              <w:t>7</w:t>
             </w:r>
           </w:p>
         </w:tc>
@@ -1908,10 +1836,10 @@
           </w:tcPr>
           <w:p>
             <w:r>
-              <w:t>192.168.10.</w:t>
-            </w:r>
-            <w:r>
-              <w:t>112</w:t>
+              <w:t>192.168.10.11</w:t>
+            </w:r>
+            <w:r>
+              <w:t>3</w:t>
             </w:r>
           </w:p>
         </w:tc>
@@ -1927,10 +1855,7 @@
           </w:tcPr>
           <w:p>
             <w:r>
-              <w:t>255.255.255.2</w:t>
-            </w:r>
-            <w:r>
-              <w:t>48</w:t>
+              <w:t>255.255.255.248</w:t>
             </w:r>
           </w:p>
         </w:tc>
@@ -1971,7 +1896,10 @@
               <w:t>192.168.10.</w:t>
             </w:r>
             <w:r>
-              <w:t>122</w:t>
+              <w:t>12</w:t>
+            </w:r>
+            <w:r>
+              <w:t>1</w:t>
             </w:r>
           </w:p>
         </w:tc>
@@ -3159,7 +3087,7 @@
 </file>
 
 <file path=word/endnotes.xml><?xml version="1.0" encoding="utf-8"?>
-<w:endnotes xmlns:wpc="http://schemas.microsoft.com/office/word/2010/wordprocessingCanvas" xmlns:cx="http://schemas.microsoft.com/office/drawing/2014/chartex" xmlns:cx1="http://schemas.microsoft.com/office/drawing/2015/9/8/chartex" xmlns:cx2="http://schemas.microsoft.com/office/drawing/2015/10/21/chartex" xmlns:cx3="http://schemas.microsoft.com/office/drawing/2016/5/9/chartex" xmlns:cx4="http://schemas.microsoft.com/office/drawing/2016/5/10/chartex" xmlns:cx5="http://schemas.microsoft.com/office/drawing/2016/5/11/chartex" xmlns:cx6="http://schemas.microsoft.com/office/drawing/2016/5/12/chartex" xmlns:cx7="http://schemas.microsoft.com/office/drawing/2016/5/13/chartex" xmlns:cx8="http://schemas.microsoft.com/office/drawing/2016/5/14/chartex" xmlns:mc="http://schemas.openxmlformats.org/markup-compatibility/2006" xmlns:aink="http://schemas.microsoft.com/office/drawing/2016/ink" xmlns:am3d="http://schemas.microsoft.com/office/drawing/2017/model3d" xmlns:o="urn:schemas-microsoft-com:office:office" xmlns:oel="http://schemas.microsoft.com/office/2019/extlst" xmlns:r="http://schemas.openxmlformats.org/officeDocument/2006/relationships" xmlns:m="http://schemas.openxmlformats.org/officeDocument/2006/math" xmlns:v="urn:schemas-microsoft-com:vml" xmlns:wp14="http://schemas.microsoft.com/office/word/2010/wordprocessingDrawing" xmlns:wp="http://schemas.openxmlformats.org/drawingml/2006/wordprocessingDrawing" xmlns:w10="urn:schemas-microsoft-com:office:word" xmlns:w="http://schemas.openxmlformats.org/wordprocessingml/2006/main" xmlns:w14="http://schemas.microsoft.com/office/word/2010/wordml" xmlns:w15="http://schemas.microsoft.com/office/word/2012/wordml" xmlns:w16cex="http://schemas.microsoft.com/office/word/2018/wordml/cex" xmlns:w16cid="http://schemas.microsoft.com/office/word/2016/wordml/cid" xmlns:w16="http://schemas.microsoft.com/office/word/2018/wordml" xmlns:w16sdtdh="http://schemas.microsoft.com/office/word/2020/wordml/sdtdatahash" xmlns:w16se="http://schemas.microsoft.com/office/word/2015/wordml/symex" xmlns:wpg="http://schemas.microsoft.com/office/word/2010/wordprocessingGroup" xmlns:wpi="http://schemas.microsoft.com/office/word/2010/wordprocessingInk" xmlns:wne="http://schemas.microsoft.com/office/word/2006/wordml" xmlns:wps="http://schemas.microsoft.com/office/word/2010/wordprocessingShape" mc:Ignorable="w14 w15 w16se w16cid w16 w16cex w16sdtdh wp14">
+<w:endnotes xmlns:wpc="http://schemas.microsoft.com/office/word/2010/wordprocessingCanvas" xmlns:cx="http://schemas.microsoft.com/office/drawing/2014/chartex" xmlns:cx1="http://schemas.microsoft.com/office/drawing/2015/9/8/chartex" xmlns:cx2="http://schemas.microsoft.com/office/drawing/2015/10/21/chartex" xmlns:cx3="http://schemas.microsoft.com/office/drawing/2016/5/9/chartex" xmlns:cx4="http://schemas.microsoft.com/office/drawing/2016/5/10/chartex" xmlns:cx5="http://schemas.microsoft.com/office/drawing/2016/5/11/chartex" xmlns:cx6="http://schemas.microsoft.com/office/drawing/2016/5/12/chartex" xmlns:cx7="http://schemas.microsoft.com/office/drawing/2016/5/13/chartex" xmlns:cx8="http://schemas.microsoft.com/office/drawing/2016/5/14/chartex" xmlns:mc="http://schemas.openxmlformats.org/markup-compatibility/2006" xmlns:aink="http://schemas.microsoft.com/office/drawing/2016/ink" xmlns:am3d="http://schemas.microsoft.com/office/drawing/2017/model3d" xmlns:o="urn:schemas-microsoft-com:office:office" xmlns:oel="http://schemas.microsoft.com/office/2019/extlst" xmlns:r="http://schemas.openxmlformats.org/officeDocument/2006/relationships" xmlns:m="http://schemas.openxmlformats.org/officeDocument/2006/math" xmlns:v="urn:schemas-microsoft-com:vml" xmlns:wp14="http://schemas.microsoft.com/office/word/2010/wordprocessingDrawing" xmlns:wp="http://schemas.openxmlformats.org/drawingml/2006/wordprocessingDrawing" xmlns:w10="urn:schemas-microsoft-com:office:word" xmlns:w="http://schemas.openxmlformats.org/wordprocessingml/2006/main" xmlns:w14="http://schemas.microsoft.com/office/word/2010/wordml" xmlns:w15="http://schemas.microsoft.com/office/word/2012/wordml" xmlns:w16cex="http://schemas.microsoft.com/office/word/2018/wordml/cex" xmlns:w16cid="http://schemas.microsoft.com/office/word/2016/wordml/cid" xmlns:w16="http://schemas.microsoft.com/office/word/2018/wordml" xmlns:w16du="http://schemas.microsoft.com/office/word/2023/wordml/word16du" xmlns:w16sdtdh="http://schemas.microsoft.com/office/word/2020/wordml/sdtdatahash" xmlns:w16sdtfl="http://schemas.microsoft.com/office/word/2024/wordml/sdtformatlock" xmlns:w16se="http://schemas.microsoft.com/office/word/2015/wordml/symex" xmlns:wpg="http://schemas.microsoft.com/office/word/2010/wordprocessingGroup" xmlns:wpi="http://schemas.microsoft.com/office/word/2010/wordprocessingInk" xmlns:wne="http://schemas.microsoft.com/office/word/2006/wordml" xmlns:wps="http://schemas.microsoft.com/office/word/2010/wordprocessingShape" mc:Ignorable="w14 w15 w16se w16cid w16 w16cex w16sdtdh w16sdtfl w16du wp14">
   <w:endnote w:type="separator" w:id="-1">
     <w:p>
       <w:r>
@@ -3178,7 +3106,7 @@
 </file>
 
 <file path=word/footer1.xml><?xml version="1.0" encoding="utf-8"?>
-<w:ftr xmlns:wpc="http://schemas.microsoft.com/office/word/2010/wordprocessingCanvas" xmlns:cx="http://schemas.microsoft.com/office/drawing/2014/chartex" xmlns:cx1="http://schemas.microsoft.com/office/drawing/2015/9/8/chartex" xmlns:cx2="http://schemas.microsoft.com/office/drawing/2015/10/21/chartex" xmlns:cx3="http://schemas.microsoft.com/office/drawing/2016/5/9/chartex" xmlns:cx4="http://schemas.microsoft.com/office/drawing/2016/5/10/chartex" xmlns:cx5="http://schemas.microsoft.com/office/drawing/2016/5/11/chartex" xmlns:cx6="http://schemas.microsoft.com/office/drawing/2016/5/12/chartex" xmlns:cx7="http://schemas.microsoft.com/office/drawing/2016/5/13/chartex" xmlns:cx8="http://schemas.microsoft.com/office/drawing/2016/5/14/chartex" xmlns:mc="http://schemas.openxmlformats.org/markup-compatibility/2006" xmlns:aink="http://schemas.microsoft.com/office/drawing/2016/ink" xmlns:am3d="http://schemas.microsoft.com/office/drawing/2017/model3d" xmlns:o="urn:schemas-microsoft-com:office:office" xmlns:oel="http://schemas.microsoft.com/office/2019/extlst" xmlns:r="http://schemas.openxmlformats.org/officeDocument/2006/relationships" xmlns:m="http://schemas.openxmlformats.org/officeDocument/2006/math" xmlns:v="urn:schemas-microsoft-com:vml" xmlns:wp14="http://schemas.microsoft.com/office/word/2010/wordprocessingDrawing" xmlns:wp="http://schemas.openxmlformats.org/drawingml/2006/wordprocessingDrawing" xmlns:w10="urn:schemas-microsoft-com:office:word" xmlns:w="http://schemas.openxmlformats.org/wordprocessingml/2006/main" xmlns:w14="http://schemas.microsoft.com/office/word/2010/wordml" xmlns:w15="http://schemas.microsoft.com/office/word/2012/wordml" xmlns:w16cex="http://schemas.microsoft.com/office/word/2018/wordml/cex" xmlns:w16cid="http://schemas.microsoft.com/office/word/2016/wordml/cid" xmlns:w16="http://schemas.microsoft.com/office/word/2018/wordml" xmlns:w16sdtdh="http://schemas.microsoft.com/office/word/2020/wordml/sdtdatahash" xmlns:w16se="http://schemas.microsoft.com/office/word/2015/wordml/symex" xmlns:wpg="http://schemas.microsoft.com/office/word/2010/wordprocessingGroup" xmlns:wpi="http://schemas.microsoft.com/office/word/2010/wordprocessingInk" xmlns:wne="http://schemas.microsoft.com/office/word/2006/wordml" xmlns:wps="http://schemas.microsoft.com/office/word/2010/wordprocessingShape" mc:Ignorable="w14 w15 w16se w16cid w16 w16cex w16sdtdh wp14">
+<w:ftr xmlns:wpc="http://schemas.microsoft.com/office/word/2010/wordprocessingCanvas" xmlns:cx="http://schemas.microsoft.com/office/drawing/2014/chartex" xmlns:cx1="http://schemas.microsoft.com/office/drawing/2015/9/8/chartex" xmlns:cx2="http://schemas.microsoft.com/office/drawing/2015/10/21/chartex" xmlns:cx3="http://schemas.microsoft.com/office/drawing/2016/5/9/chartex" xmlns:cx4="http://schemas.microsoft.com/office/drawing/2016/5/10/chartex" xmlns:cx5="http://schemas.microsoft.com/office/drawing/2016/5/11/chartex" xmlns:cx6="http://schemas.microsoft.com/office/drawing/2016/5/12/chartex" xmlns:cx7="http://schemas.microsoft.com/office/drawing/2016/5/13/chartex" xmlns:cx8="http://schemas.microsoft.com/office/drawing/2016/5/14/chartex" xmlns:mc="http://schemas.openxmlformats.org/markup-compatibility/2006" xmlns:aink="http://schemas.microsoft.com/office/drawing/2016/ink" xmlns:am3d="http://schemas.microsoft.com/office/drawing/2017/model3d" xmlns:o="urn:schemas-microsoft-com:office:office" xmlns:oel="http://schemas.microsoft.com/office/2019/extlst" xmlns:r="http://schemas.openxmlformats.org/officeDocument/2006/relationships" xmlns:m="http://schemas.openxmlformats.org/officeDocument/2006/math" xmlns:v="urn:schemas-microsoft-com:vml" xmlns:wp14="http://schemas.microsoft.com/office/word/2010/wordprocessingDrawing" xmlns:wp="http://schemas.openxmlformats.org/drawingml/2006/wordprocessingDrawing" xmlns:w10="urn:schemas-microsoft-com:office:word" xmlns:w="http://schemas.openxmlformats.org/wordprocessingml/2006/main" xmlns:w14="http://schemas.microsoft.com/office/word/2010/wordml" xmlns:w15="http://schemas.microsoft.com/office/word/2012/wordml" xmlns:w16cex="http://schemas.microsoft.com/office/word/2018/wordml/cex" xmlns:w16cid="http://schemas.microsoft.com/office/word/2016/wordml/cid" xmlns:w16="http://schemas.microsoft.com/office/word/2018/wordml" xmlns:w16du="http://schemas.microsoft.com/office/word/2023/wordml/word16du" xmlns:w16sdtdh="http://schemas.microsoft.com/office/word/2020/wordml/sdtdatahash" xmlns:w16sdtfl="http://schemas.microsoft.com/office/word/2024/wordml/sdtformatlock" xmlns:w16se="http://schemas.microsoft.com/office/word/2015/wordml/symex" xmlns:wpg="http://schemas.microsoft.com/office/word/2010/wordprocessingGroup" xmlns:wpi="http://schemas.microsoft.com/office/word/2010/wordprocessingInk" xmlns:wne="http://schemas.microsoft.com/office/word/2006/wordml" xmlns:wps="http://schemas.microsoft.com/office/word/2010/wordprocessingShape" mc:Ignorable="w14 w15 w16se w16cid w16 w16cex w16sdtdh w16sdtfl w16du wp14">
   <w:p>
     <w:pPr>
       <w:pStyle w:val="Footer"/>
@@ -3188,7 +3116,7 @@
 </file>
 
 <file path=word/footer2.xml><?xml version="1.0" encoding="utf-8"?>
-<w:ftr xmlns:wpc="http://schemas.microsoft.com/office/word/2010/wordprocessingCanvas" xmlns:cx="http://schemas.microsoft.com/office/drawing/2014/chartex" xmlns:cx1="http://schemas.microsoft.com/office/drawing/2015/9/8/chartex" xmlns:cx2="http://schemas.microsoft.com/office/drawing/2015/10/21/chartex" xmlns:cx3="http://schemas.microsoft.com/office/drawing/2016/5/9/chartex" xmlns:cx4="http://schemas.microsoft.com/office/drawing/2016/5/10/chartex" xmlns:cx5="http://schemas.microsoft.com/office/drawing/2016/5/11/chartex" xmlns:cx6="http://schemas.microsoft.com/office/drawing/2016/5/12/chartex" xmlns:cx7="http://schemas.microsoft.com/office/drawing/2016/5/13/chartex" xmlns:cx8="http://schemas.microsoft.com/office/drawing/2016/5/14/chartex" xmlns:mc="http://schemas.openxmlformats.org/markup-compatibility/2006" xmlns:aink="http://schemas.microsoft.com/office/drawing/2016/ink" xmlns:am3d="http://schemas.microsoft.com/office/drawing/2017/model3d" xmlns:o="urn:schemas-microsoft-com:office:office" xmlns:oel="http://schemas.microsoft.com/office/2019/extlst" xmlns:r="http://schemas.openxmlformats.org/officeDocument/2006/relationships" xmlns:m="http://schemas.openxmlformats.org/officeDocument/2006/math" xmlns:v="urn:schemas-microsoft-com:vml" xmlns:wp14="http://schemas.microsoft.com/office/word/2010/wordprocessingDrawing" xmlns:wp="http://schemas.openxmlformats.org/drawingml/2006/wordprocessingDrawing" xmlns:w10="urn:schemas-microsoft-com:office:word" xmlns:w="http://schemas.openxmlformats.org/wordprocessingml/2006/main" xmlns:w14="http://schemas.microsoft.com/office/word/2010/wordml" xmlns:w15="http://schemas.microsoft.com/office/word/2012/wordml" xmlns:w16cex="http://schemas.microsoft.com/office/word/2018/wordml/cex" xmlns:w16cid="http://schemas.microsoft.com/office/word/2016/wordml/cid" xmlns:w16="http://schemas.microsoft.com/office/word/2018/wordml" xmlns:w16sdtdh="http://schemas.microsoft.com/office/word/2020/wordml/sdtdatahash" xmlns:w16se="http://schemas.microsoft.com/office/word/2015/wordml/symex" xmlns:wpg="http://schemas.microsoft.com/office/word/2010/wordprocessingGroup" xmlns:wpi="http://schemas.microsoft.com/office/word/2010/wordprocessingInk" xmlns:wne="http://schemas.microsoft.com/office/word/2006/wordml" xmlns:wps="http://schemas.microsoft.com/office/word/2010/wordprocessingShape" mc:Ignorable="w14 w15 w16se w16cid w16 w16cex w16sdtdh wp14">
+<w:ftr xmlns:wpc="http://schemas.microsoft.com/office/word/2010/wordprocessingCanvas" xmlns:cx="http://schemas.microsoft.com/office/drawing/2014/chartex" xmlns:cx1="http://schemas.microsoft.com/office/drawing/2015/9/8/chartex" xmlns:cx2="http://schemas.microsoft.com/office/drawing/2015/10/21/chartex" xmlns:cx3="http://schemas.microsoft.com/office/drawing/2016/5/9/chartex" xmlns:cx4="http://schemas.microsoft.com/office/drawing/2016/5/10/chartex" xmlns:cx5="http://schemas.microsoft.com/office/drawing/2016/5/11/chartex" xmlns:cx6="http://schemas.microsoft.com/office/drawing/2016/5/12/chartex" xmlns:cx7="http://schemas.microsoft.com/office/drawing/2016/5/13/chartex" xmlns:cx8="http://schemas.microsoft.com/office/drawing/2016/5/14/chartex" xmlns:mc="http://schemas.openxmlformats.org/markup-compatibility/2006" xmlns:aink="http://schemas.microsoft.com/office/drawing/2016/ink" xmlns:am3d="http://schemas.microsoft.com/office/drawing/2017/model3d" xmlns:o="urn:schemas-microsoft-com:office:office" xmlns:oel="http://schemas.microsoft.com/office/2019/extlst" xmlns:r="http://schemas.openxmlformats.org/officeDocument/2006/relationships" xmlns:m="http://schemas.openxmlformats.org/officeDocument/2006/math" xmlns:v="urn:schemas-microsoft-com:vml" xmlns:wp14="http://schemas.microsoft.com/office/word/2010/wordprocessingDrawing" xmlns:wp="http://schemas.openxmlformats.org/drawingml/2006/wordprocessingDrawing" xmlns:w10="urn:schemas-microsoft-com:office:word" xmlns:w="http://schemas.openxmlformats.org/wordprocessingml/2006/main" xmlns:w14="http://schemas.microsoft.com/office/word/2010/wordml" xmlns:w15="http://schemas.microsoft.com/office/word/2012/wordml" xmlns:w16cex="http://schemas.microsoft.com/office/word/2018/wordml/cex" xmlns:w16cid="http://schemas.microsoft.com/office/word/2016/wordml/cid" xmlns:w16="http://schemas.microsoft.com/office/word/2018/wordml" xmlns:w16du="http://schemas.microsoft.com/office/word/2023/wordml/word16du" xmlns:w16sdtdh="http://schemas.microsoft.com/office/word/2020/wordml/sdtdatahash" xmlns:w16sdtfl="http://schemas.microsoft.com/office/word/2024/wordml/sdtformatlock" xmlns:w16se="http://schemas.microsoft.com/office/word/2015/wordml/symex" xmlns:wpg="http://schemas.microsoft.com/office/word/2010/wordprocessingGroup" xmlns:wpi="http://schemas.microsoft.com/office/word/2010/wordprocessingInk" xmlns:wne="http://schemas.microsoft.com/office/word/2006/wordml" xmlns:wps="http://schemas.microsoft.com/office/word/2010/wordprocessingShape" mc:Ignorable="w14 w15 w16se w16cid w16 w16cex w16sdtdh w16sdtfl w16du wp14">
   <w:p>
     <w:pPr>
       <w:jc w:val="center"/>
@@ -3221,7 +3149,7 @@
 </file>
 
 <file path=word/footer3.xml><?xml version="1.0" encoding="utf-8"?>
-<w:ftr xmlns:wpc="http://schemas.microsoft.com/office/word/2010/wordprocessingCanvas" xmlns:cx="http://schemas.microsoft.com/office/drawing/2014/chartex" xmlns:cx1="http://schemas.microsoft.com/office/drawing/2015/9/8/chartex" xmlns:cx2="http://schemas.microsoft.com/office/drawing/2015/10/21/chartex" xmlns:cx3="http://schemas.microsoft.com/office/drawing/2016/5/9/chartex" xmlns:cx4="http://schemas.microsoft.com/office/drawing/2016/5/10/chartex" xmlns:cx5="http://schemas.microsoft.com/office/drawing/2016/5/11/chartex" xmlns:cx6="http://schemas.microsoft.com/office/drawing/2016/5/12/chartex" xmlns:cx7="http://schemas.microsoft.com/office/drawing/2016/5/13/chartex" xmlns:cx8="http://schemas.microsoft.com/office/drawing/2016/5/14/chartex" xmlns:mc="http://schemas.openxmlformats.org/markup-compatibility/2006" xmlns:aink="http://schemas.microsoft.com/office/drawing/2016/ink" xmlns:am3d="http://schemas.microsoft.com/office/drawing/2017/model3d" xmlns:o="urn:schemas-microsoft-com:office:office" xmlns:oel="http://schemas.microsoft.com/office/2019/extlst" xmlns:r="http://schemas.openxmlformats.org/officeDocument/2006/relationships" xmlns:m="http://schemas.openxmlformats.org/officeDocument/2006/math" xmlns:v="urn:schemas-microsoft-com:vml" xmlns:wp14="http://schemas.microsoft.com/office/word/2010/wordprocessingDrawing" xmlns:wp="http://schemas.openxmlformats.org/drawingml/2006/wordprocessingDrawing" xmlns:w10="urn:schemas-microsoft-com:office:word" xmlns:w="http://schemas.openxmlformats.org/wordprocessingml/2006/main" xmlns:w14="http://schemas.microsoft.com/office/word/2010/wordml" xmlns:w15="http://schemas.microsoft.com/office/word/2012/wordml" xmlns:w16cex="http://schemas.microsoft.com/office/word/2018/wordml/cex" xmlns:w16cid="http://schemas.microsoft.com/office/word/2016/wordml/cid" xmlns:w16="http://schemas.microsoft.com/office/word/2018/wordml" xmlns:w16sdtdh="http://schemas.microsoft.com/office/word/2020/wordml/sdtdatahash" xmlns:w16se="http://schemas.microsoft.com/office/word/2015/wordml/symex" xmlns:wpg="http://schemas.microsoft.com/office/word/2010/wordprocessingGroup" xmlns:wpi="http://schemas.microsoft.com/office/word/2010/wordprocessingInk" xmlns:wne="http://schemas.microsoft.com/office/word/2006/wordml" xmlns:wps="http://schemas.microsoft.com/office/word/2010/wordprocessingShape" mc:Ignorable="w14 w15 w16se w16cid w16 w16cex w16sdtdh wp14">
+<w:ftr xmlns:wpc="http://schemas.microsoft.com/office/word/2010/wordprocessingCanvas" xmlns:cx="http://schemas.microsoft.com/office/drawing/2014/chartex" xmlns:cx1="http://schemas.microsoft.com/office/drawing/2015/9/8/chartex" xmlns:cx2="http://schemas.microsoft.com/office/drawing/2015/10/21/chartex" xmlns:cx3="http://schemas.microsoft.com/office/drawing/2016/5/9/chartex" xmlns:cx4="http://schemas.microsoft.com/office/drawing/2016/5/10/chartex" xmlns:cx5="http://schemas.microsoft.com/office/drawing/2016/5/11/chartex" xmlns:cx6="http://schemas.microsoft.com/office/drawing/2016/5/12/chartex" xmlns:cx7="http://schemas.microsoft.com/office/drawing/2016/5/13/chartex" xmlns:cx8="http://schemas.microsoft.com/office/drawing/2016/5/14/chartex" xmlns:mc="http://schemas.openxmlformats.org/markup-compatibility/2006" xmlns:aink="http://schemas.microsoft.com/office/drawing/2016/ink" xmlns:am3d="http://schemas.microsoft.com/office/drawing/2017/model3d" xmlns:o="urn:schemas-microsoft-com:office:office" xmlns:oel="http://schemas.microsoft.com/office/2019/extlst" xmlns:r="http://schemas.openxmlformats.org/officeDocument/2006/relationships" xmlns:m="http://schemas.openxmlformats.org/officeDocument/2006/math" xmlns:v="urn:schemas-microsoft-com:vml" xmlns:wp14="http://schemas.microsoft.com/office/word/2010/wordprocessingDrawing" xmlns:wp="http://schemas.openxmlformats.org/drawingml/2006/wordprocessingDrawing" xmlns:w10="urn:schemas-microsoft-com:office:word" xmlns:w="http://schemas.openxmlformats.org/wordprocessingml/2006/main" xmlns:w14="http://schemas.microsoft.com/office/word/2010/wordml" xmlns:w15="http://schemas.microsoft.com/office/word/2012/wordml" xmlns:w16cex="http://schemas.microsoft.com/office/word/2018/wordml/cex" xmlns:w16cid="http://schemas.microsoft.com/office/word/2016/wordml/cid" xmlns:w16="http://schemas.microsoft.com/office/word/2018/wordml" xmlns:w16du="http://schemas.microsoft.com/office/word/2023/wordml/word16du" xmlns:w16sdtdh="http://schemas.microsoft.com/office/word/2020/wordml/sdtdatahash" xmlns:w16sdtfl="http://schemas.microsoft.com/office/word/2024/wordml/sdtformatlock" xmlns:w16se="http://schemas.microsoft.com/office/word/2015/wordml/symex" xmlns:wpg="http://schemas.microsoft.com/office/word/2010/wordprocessingGroup" xmlns:wpi="http://schemas.microsoft.com/office/word/2010/wordprocessingInk" xmlns:wne="http://schemas.microsoft.com/office/word/2006/wordml" xmlns:wps="http://schemas.microsoft.com/office/word/2010/wordprocessingShape" mc:Ignorable="w14 w15 w16se w16cid w16 w16cex w16sdtdh w16sdtfl w16du wp14">
   <w:p>
     <w:pPr>
       <w:jc w:val="center"/>
@@ -3254,7 +3182,7 @@
 </file>
 
 <file path=word/footnotes.xml><?xml version="1.0" encoding="utf-8"?>
-<w:footnotes xmlns:wpc="http://schemas.microsoft.com/office/word/2010/wordprocessingCanvas" xmlns:cx="http://schemas.microsoft.com/office/drawing/2014/chartex" xmlns:cx1="http://schemas.microsoft.com/office/drawing/2015/9/8/chartex" xmlns:cx2="http://schemas.microsoft.com/office/drawing/2015/10/21/chartex" xmlns:cx3="http://schemas.microsoft.com/office/drawing/2016/5/9/chartex" xmlns:cx4="http://schemas.microsoft.com/office/drawing/2016/5/10/chartex" xmlns:cx5="http://schemas.microsoft.com/office/drawing/2016/5/11/chartex" xmlns:cx6="http://schemas.microsoft.com/office/drawing/2016/5/12/chartex" xmlns:cx7="http://schemas.microsoft.com/office/drawing/2016/5/13/chartex" xmlns:cx8="http://schemas.microsoft.com/office/drawing/2016/5/14/chartex" xmlns:mc="http://schemas.openxmlformats.org/markup-compatibility/2006" xmlns:aink="http://schemas.microsoft.com/office/drawing/2016/ink" xmlns:am3d="http://schemas.microsoft.com/office/drawing/2017/model3d" xmlns:o="urn:schemas-microsoft-com:office:office" xmlns:oel="http://schemas.microsoft.com/office/2019/extlst" xmlns:r="http://schemas.openxmlformats.org/officeDocument/2006/relationships" xmlns:m="http://schemas.openxmlformats.org/officeDocument/2006/math" xmlns:v="urn:schemas-microsoft-com:vml" xmlns:wp14="http://schemas.microsoft.com/office/word/2010/wordprocessingDrawing" xmlns:wp="http://schemas.openxmlformats.org/drawingml/2006/wordprocessingDrawing" xmlns:w10="urn:schemas-microsoft-com:office:word" xmlns:w="http://schemas.openxmlformats.org/wordprocessingml/2006/main" xmlns:w14="http://schemas.microsoft.com/office/word/2010/wordml" xmlns:w15="http://schemas.microsoft.com/office/word/2012/wordml" xmlns:w16cex="http://schemas.microsoft.com/office/word/2018/wordml/cex" xmlns:w16cid="http://schemas.microsoft.com/office/word/2016/wordml/cid" xmlns:w16="http://schemas.microsoft.com/office/word/2018/wordml" xmlns:w16sdtdh="http://schemas.microsoft.com/office/word/2020/wordml/sdtdatahash" xmlns:w16se="http://schemas.microsoft.com/office/word/2015/wordml/symex" xmlns:wpg="http://schemas.microsoft.com/office/word/2010/wordprocessingGroup" xmlns:wpi="http://schemas.microsoft.com/office/word/2010/wordprocessingInk" xmlns:wne="http://schemas.microsoft.com/office/word/2006/wordml" xmlns:wps="http://schemas.microsoft.com/office/word/2010/wordprocessingShape" mc:Ignorable="w14 w15 w16se w16cid w16 w16cex w16sdtdh wp14">
+<w:footnotes xmlns:wpc="http://schemas.microsoft.com/office/word/2010/wordprocessingCanvas" xmlns:cx="http://schemas.microsoft.com/office/drawing/2014/chartex" xmlns:cx1="http://schemas.microsoft.com/office/drawing/2015/9/8/chartex" xmlns:cx2="http://schemas.microsoft.com/office/drawing/2015/10/21/chartex" xmlns:cx3="http://schemas.microsoft.com/office/drawing/2016/5/9/chartex" xmlns:cx4="http://schemas.microsoft.com/office/drawing/2016/5/10/chartex" xmlns:cx5="http://schemas.microsoft.com/office/drawing/2016/5/11/chartex" xmlns:cx6="http://schemas.microsoft.com/office/drawing/2016/5/12/chartex" xmlns:cx7="http://schemas.microsoft.com/office/drawing/2016/5/13/chartex" xmlns:cx8="http://schemas.microsoft.com/office/drawing/2016/5/14/chartex" xmlns:mc="http://schemas.openxmlformats.org/markup-compatibility/2006" xmlns:aink="http://schemas.microsoft.com/office/drawing/2016/ink" xmlns:am3d="http://schemas.microsoft.com/office/drawing/2017/model3d" xmlns:o="urn:schemas-microsoft-com:office:office" xmlns:oel="http://schemas.microsoft.com/office/2019/extlst" xmlns:r="http://schemas.openxmlformats.org/officeDocument/2006/relationships" xmlns:m="http://schemas.openxmlformats.org/officeDocument/2006/math" xmlns:v="urn:schemas-microsoft-com:vml" xmlns:wp14="http://schemas.microsoft.com/office/word/2010/wordprocessingDrawing" xmlns:wp="http://schemas.openxmlformats.org/drawingml/2006/wordprocessingDrawing" xmlns:w10="urn:schemas-microsoft-com:office:word" xmlns:w="http://schemas.openxmlformats.org/wordprocessingml/2006/main" xmlns:w14="http://schemas.microsoft.com/office/word/2010/wordml" xmlns:w15="http://schemas.microsoft.com/office/word/2012/wordml" xmlns:w16cex="http://schemas.microsoft.com/office/word/2018/wordml/cex" xmlns:w16cid="http://schemas.microsoft.com/office/word/2016/wordml/cid" xmlns:w16="http://schemas.microsoft.com/office/word/2018/wordml" xmlns:w16du="http://schemas.microsoft.com/office/word/2023/wordml/word16du" xmlns:w16sdtdh="http://schemas.microsoft.com/office/word/2020/wordml/sdtdatahash" xmlns:w16sdtfl="http://schemas.microsoft.com/office/word/2024/wordml/sdtformatlock" xmlns:w16se="http://schemas.microsoft.com/office/word/2015/wordml/symex" xmlns:wpg="http://schemas.microsoft.com/office/word/2010/wordprocessingGroup" xmlns:wpi="http://schemas.microsoft.com/office/word/2010/wordprocessingInk" xmlns:wne="http://schemas.microsoft.com/office/word/2006/wordml" xmlns:wps="http://schemas.microsoft.com/office/word/2010/wordprocessingShape" mc:Ignorable="w14 w15 w16se w16cid w16 w16cex w16sdtdh w16sdtfl w16du wp14">
   <w:footnote w:type="separator" w:id="-1">
     <w:p>
       <w:r>
@@ -3273,7 +3201,7 @@
 </file>
 
 <file path=word/header1.xml><?xml version="1.0" encoding="utf-8"?>
-<w:hdr xmlns:wpc="http://schemas.microsoft.com/office/word/2010/wordprocessingCanvas" xmlns:cx="http://schemas.microsoft.com/office/drawing/2014/chartex" xmlns:cx1="http://schemas.microsoft.com/office/drawing/2015/9/8/chartex" xmlns:cx2="http://schemas.microsoft.com/office/drawing/2015/10/21/chartex" xmlns:cx3="http://schemas.microsoft.com/office/drawing/2016/5/9/chartex" xmlns:cx4="http://schemas.microsoft.com/office/drawing/2016/5/10/chartex" xmlns:cx5="http://schemas.microsoft.com/office/drawing/2016/5/11/chartex" xmlns:cx6="http://schemas.microsoft.com/office/drawing/2016/5/12/chartex" xmlns:cx7="http://schemas.microsoft.com/office/drawing/2016/5/13/chartex" xmlns:cx8="http://schemas.microsoft.com/office/drawing/2016/5/14/chartex" xmlns:mc="http://schemas.openxmlformats.org/markup-compatibility/2006" xmlns:aink="http://schemas.microsoft.com/office/drawing/2016/ink" xmlns:am3d="http://schemas.microsoft.com/office/drawing/2017/model3d" xmlns:o="urn:schemas-microsoft-com:office:office" xmlns:oel="http://schemas.microsoft.com/office/2019/extlst" xmlns:r="http://schemas.openxmlformats.org/officeDocument/2006/relationships" xmlns:m="http://schemas.openxmlformats.org/officeDocument/2006/math" xmlns:v="urn:schemas-microsoft-com:vml" xmlns:wp14="http://schemas.microsoft.com/office/word/2010/wordprocessingDrawing" xmlns:wp="http://schemas.openxmlformats.org/drawingml/2006/wordprocessingDrawing" xmlns:w10="urn:schemas-microsoft-com:office:word" xmlns:w="http://schemas.openxmlformats.org/wordprocessingml/2006/main" xmlns:w14="http://schemas.microsoft.com/office/word/2010/wordml" xmlns:w15="http://schemas.microsoft.com/office/word/2012/wordml" xmlns:w16cex="http://schemas.microsoft.com/office/word/2018/wordml/cex" xmlns:w16cid="http://schemas.microsoft.com/office/word/2016/wordml/cid" xmlns:w16="http://schemas.microsoft.com/office/word/2018/wordml" xmlns:w16sdtdh="http://schemas.microsoft.com/office/word/2020/wordml/sdtdatahash" xmlns:w16se="http://schemas.microsoft.com/office/word/2015/wordml/symex" xmlns:wpg="http://schemas.microsoft.com/office/word/2010/wordprocessingGroup" xmlns:wpi="http://schemas.microsoft.com/office/word/2010/wordprocessingInk" xmlns:wne="http://schemas.microsoft.com/office/word/2006/wordml" xmlns:wps="http://schemas.microsoft.com/office/word/2010/wordprocessingShape" mc:Ignorable="w14 w15 w16se w16cid w16 w16cex w16sdtdh wp14">
+<w:hdr xmlns:wpc="http://schemas.microsoft.com/office/word/2010/wordprocessingCanvas" xmlns:cx="http://schemas.microsoft.com/office/drawing/2014/chartex" xmlns:cx1="http://schemas.microsoft.com/office/drawing/2015/9/8/chartex" xmlns:cx2="http://schemas.microsoft.com/office/drawing/2015/10/21/chartex" xmlns:cx3="http://schemas.microsoft.com/office/drawing/2016/5/9/chartex" xmlns:cx4="http://schemas.microsoft.com/office/drawing/2016/5/10/chartex" xmlns:cx5="http://schemas.microsoft.com/office/drawing/2016/5/11/chartex" xmlns:cx6="http://schemas.microsoft.com/office/drawing/2016/5/12/chartex" xmlns:cx7="http://schemas.microsoft.com/office/drawing/2016/5/13/chartex" xmlns:cx8="http://schemas.microsoft.com/office/drawing/2016/5/14/chartex" xmlns:mc="http://schemas.openxmlformats.org/markup-compatibility/2006" xmlns:aink="http://schemas.microsoft.com/office/drawing/2016/ink" xmlns:am3d="http://schemas.microsoft.com/office/drawing/2017/model3d" xmlns:o="urn:schemas-microsoft-com:office:office" xmlns:oel="http://schemas.microsoft.com/office/2019/extlst" xmlns:r="http://schemas.openxmlformats.org/officeDocument/2006/relationships" xmlns:m="http://schemas.openxmlformats.org/officeDocument/2006/math" xmlns:v="urn:schemas-microsoft-com:vml" xmlns:wp14="http://schemas.microsoft.com/office/word/2010/wordprocessingDrawing" xmlns:wp="http://schemas.openxmlformats.org/drawingml/2006/wordprocessingDrawing" xmlns:w10="urn:schemas-microsoft-com:office:word" xmlns:w="http://schemas.openxmlformats.org/wordprocessingml/2006/main" xmlns:w14="http://schemas.microsoft.com/office/word/2010/wordml" xmlns:w15="http://schemas.microsoft.com/office/word/2012/wordml" xmlns:w16cex="http://schemas.microsoft.com/office/word/2018/wordml/cex" xmlns:w16cid="http://schemas.microsoft.com/office/word/2016/wordml/cid" xmlns:w16="http://schemas.microsoft.com/office/word/2018/wordml" xmlns:w16du="http://schemas.microsoft.com/office/word/2023/wordml/word16du" xmlns:w16sdtdh="http://schemas.microsoft.com/office/word/2020/wordml/sdtdatahash" xmlns:w16sdtfl="http://schemas.microsoft.com/office/word/2024/wordml/sdtformatlock" xmlns:w16se="http://schemas.microsoft.com/office/word/2015/wordml/symex" xmlns:wpg="http://schemas.microsoft.com/office/word/2010/wordprocessingGroup" xmlns:wpi="http://schemas.microsoft.com/office/word/2010/wordprocessingInk" xmlns:wne="http://schemas.microsoft.com/office/word/2006/wordml" xmlns:wps="http://schemas.microsoft.com/office/word/2010/wordprocessingShape" mc:Ignorable="w14 w15 w16se w16cid w16 w16cex w16sdtdh w16sdtfl w16du wp14">
   <w:p>
     <w:pPr>
       <w:pStyle w:val="Header"/>
@@ -3283,7 +3211,7 @@
 </file>
 
 <file path=word/header2.xml><?xml version="1.0" encoding="utf-8"?>
-<w:hdr xmlns:wpc="http://schemas.microsoft.com/office/word/2010/wordprocessingCanvas" xmlns:cx="http://schemas.microsoft.com/office/drawing/2014/chartex" xmlns:cx1="http://schemas.microsoft.com/office/drawing/2015/9/8/chartex" xmlns:cx2="http://schemas.microsoft.com/office/drawing/2015/10/21/chartex" xmlns:cx3="http://schemas.microsoft.com/office/drawing/2016/5/9/chartex" xmlns:cx4="http://schemas.microsoft.com/office/drawing/2016/5/10/chartex" xmlns:cx5="http://schemas.microsoft.com/office/drawing/2016/5/11/chartex" xmlns:cx6="http://schemas.microsoft.com/office/drawing/2016/5/12/chartex" xmlns:cx7="http://schemas.microsoft.com/office/drawing/2016/5/13/chartex" xmlns:cx8="http://schemas.microsoft.com/office/drawing/2016/5/14/chartex" xmlns:mc="http://schemas.openxmlformats.org/markup-compatibility/2006" xmlns:aink="http://schemas.microsoft.com/office/drawing/2016/ink" xmlns:am3d="http://schemas.microsoft.com/office/drawing/2017/model3d" xmlns:o="urn:schemas-microsoft-com:office:office" xmlns:oel="http://schemas.microsoft.com/office/2019/extlst" xmlns:r="http://schemas.openxmlformats.org/officeDocument/2006/relationships" xmlns:m="http://schemas.openxmlformats.org/officeDocument/2006/math" xmlns:v="urn:schemas-microsoft-com:vml" xmlns:wp14="http://schemas.microsoft.com/office/word/2010/wordprocessingDrawing" xmlns:wp="http://schemas.openxmlformats.org/drawingml/2006/wordprocessingDrawing" xmlns:w10="urn:schemas-microsoft-com:office:word" xmlns:w="http://schemas.openxmlformats.org/wordprocessingml/2006/main" xmlns:w14="http://schemas.microsoft.com/office/word/2010/wordml" xmlns:w15="http://schemas.microsoft.com/office/word/2012/wordml" xmlns:w16cex="http://schemas.microsoft.com/office/word/2018/wordml/cex" xmlns:w16cid="http://schemas.microsoft.com/office/word/2016/wordml/cid" xmlns:w16="http://schemas.microsoft.com/office/word/2018/wordml" xmlns:w16sdtdh="http://schemas.microsoft.com/office/word/2020/wordml/sdtdatahash" xmlns:w16se="http://schemas.microsoft.com/office/word/2015/wordml/symex" xmlns:wpg="http://schemas.microsoft.com/office/word/2010/wordprocessingGroup" xmlns:wpi="http://schemas.microsoft.com/office/word/2010/wordprocessingInk" xmlns:wne="http://schemas.microsoft.com/office/word/2006/wordml" xmlns:wps="http://schemas.microsoft.com/office/word/2010/wordprocessingShape" mc:Ignorable="w14 w15 w16se w16cid w16 w16cex w16sdtdh wp14">
+<w:hdr xmlns:wpc="http://schemas.microsoft.com/office/word/2010/wordprocessingCanvas" xmlns:cx="http://schemas.microsoft.com/office/drawing/2014/chartex" xmlns:cx1="http://schemas.microsoft.com/office/drawing/2015/9/8/chartex" xmlns:cx2="http://schemas.microsoft.com/office/drawing/2015/10/21/chartex" xmlns:cx3="http://schemas.microsoft.com/office/drawing/2016/5/9/chartex" xmlns:cx4="http://schemas.microsoft.com/office/drawing/2016/5/10/chartex" xmlns:cx5="http://schemas.microsoft.com/office/drawing/2016/5/11/chartex" xmlns:cx6="http://schemas.microsoft.com/office/drawing/2016/5/12/chartex" xmlns:cx7="http://schemas.microsoft.com/office/drawing/2016/5/13/chartex" xmlns:cx8="http://schemas.microsoft.com/office/drawing/2016/5/14/chartex" xmlns:mc="http://schemas.openxmlformats.org/markup-compatibility/2006" xmlns:aink="http://schemas.microsoft.com/office/drawing/2016/ink" xmlns:am3d="http://schemas.microsoft.com/office/drawing/2017/model3d" xmlns:o="urn:schemas-microsoft-com:office:office" xmlns:oel="http://schemas.microsoft.com/office/2019/extlst" xmlns:r="http://schemas.openxmlformats.org/officeDocument/2006/relationships" xmlns:m="http://schemas.openxmlformats.org/officeDocument/2006/math" xmlns:v="urn:schemas-microsoft-com:vml" xmlns:wp14="http://schemas.microsoft.com/office/word/2010/wordprocessingDrawing" xmlns:wp="http://schemas.openxmlformats.org/drawingml/2006/wordprocessingDrawing" xmlns:w10="urn:schemas-microsoft-com:office:word" xmlns:w="http://schemas.openxmlformats.org/wordprocessingml/2006/main" xmlns:w14="http://schemas.microsoft.com/office/word/2010/wordml" xmlns:w15="http://schemas.microsoft.com/office/word/2012/wordml" xmlns:w16cex="http://schemas.microsoft.com/office/word/2018/wordml/cex" xmlns:w16cid="http://schemas.microsoft.com/office/word/2016/wordml/cid" xmlns:w16="http://schemas.microsoft.com/office/word/2018/wordml" xmlns:w16du="http://schemas.microsoft.com/office/word/2023/wordml/word16du" xmlns:w16sdtdh="http://schemas.microsoft.com/office/word/2020/wordml/sdtdatahash" xmlns:w16sdtfl="http://schemas.microsoft.com/office/word/2024/wordml/sdtformatlock" xmlns:w16se="http://schemas.microsoft.com/office/word/2015/wordml/symex" xmlns:wpg="http://schemas.microsoft.com/office/word/2010/wordprocessingGroup" xmlns:wpi="http://schemas.microsoft.com/office/word/2010/wordprocessingInk" xmlns:wne="http://schemas.microsoft.com/office/word/2006/wordml" xmlns:wps="http://schemas.microsoft.com/office/word/2010/wordprocessingShape" mc:Ignorable="w14 w15 w16se w16cid w16 w16cex w16sdtdh w16sdtfl w16du wp14">
   <w:p>
     <w:pPr>
       <w:jc w:val="right"/>
@@ -3301,7 +3229,7 @@
 </file>
 
 <file path=word/header3.xml><?xml version="1.0" encoding="utf-8"?>
-<w:hdr xmlns:wpc="http://schemas.microsoft.com/office/word/2010/wordprocessingCanvas" xmlns:cx="http://schemas.microsoft.com/office/drawing/2014/chartex" xmlns:cx1="http://schemas.microsoft.com/office/drawing/2015/9/8/chartex" xmlns:cx2="http://schemas.microsoft.com/office/drawing/2015/10/21/chartex" xmlns:cx3="http://schemas.microsoft.com/office/drawing/2016/5/9/chartex" xmlns:cx4="http://schemas.microsoft.com/office/drawing/2016/5/10/chartex" xmlns:cx5="http://schemas.microsoft.com/office/drawing/2016/5/11/chartex" xmlns:cx6="http://schemas.microsoft.com/office/drawing/2016/5/12/chartex" xmlns:cx7="http://schemas.microsoft.com/office/drawing/2016/5/13/chartex" xmlns:cx8="http://schemas.microsoft.com/office/drawing/2016/5/14/chartex" xmlns:mc="http://schemas.openxmlformats.org/markup-compatibility/2006" xmlns:aink="http://schemas.microsoft.com/office/drawing/2016/ink" xmlns:am3d="http://schemas.microsoft.com/office/drawing/2017/model3d" xmlns:o="urn:schemas-microsoft-com:office:office" xmlns:oel="http://schemas.microsoft.com/office/2019/extlst" xmlns:r="http://schemas.openxmlformats.org/officeDocument/2006/relationships" xmlns:m="http://schemas.openxmlformats.org/officeDocument/2006/math" xmlns:v="urn:schemas-microsoft-com:vml" xmlns:wp14="http://schemas.microsoft.com/office/word/2010/wordprocessingDrawing" xmlns:wp="http://schemas.openxmlformats.org/drawingml/2006/wordprocessingDrawing" xmlns:w10="urn:schemas-microsoft-com:office:word" xmlns:w="http://schemas.openxmlformats.org/wordprocessingml/2006/main" xmlns:w14="http://schemas.microsoft.com/office/word/2010/wordml" xmlns:w15="http://schemas.microsoft.com/office/word/2012/wordml" xmlns:w16cex="http://schemas.microsoft.com/office/word/2018/wordml/cex" xmlns:w16cid="http://schemas.microsoft.com/office/word/2016/wordml/cid" xmlns:w16="http://schemas.microsoft.com/office/word/2018/wordml" xmlns:w16sdtdh="http://schemas.microsoft.com/office/word/2020/wordml/sdtdatahash" xmlns:w16se="http://schemas.microsoft.com/office/word/2015/wordml/symex" xmlns:wpg="http://schemas.microsoft.com/office/word/2010/wordprocessingGroup" xmlns:wpi="http://schemas.microsoft.com/office/word/2010/wordprocessingInk" xmlns:wne="http://schemas.microsoft.com/office/word/2006/wordml" xmlns:wps="http://schemas.microsoft.com/office/word/2010/wordprocessingShape" mc:Ignorable="w14 w15 w16se w16cid w16 w16cex w16sdtdh wp14">
+<w:hdr xmlns:wpc="http://schemas.microsoft.com/office/word/2010/wordprocessingCanvas" xmlns:cx="http://schemas.microsoft.com/office/drawing/2014/chartex" xmlns:cx1="http://schemas.microsoft.com/office/drawing/2015/9/8/chartex" xmlns:cx2="http://schemas.microsoft.com/office/drawing/2015/10/21/chartex" xmlns:cx3="http://schemas.microsoft.com/office/drawing/2016/5/9/chartex" xmlns:cx4="http://schemas.microsoft.com/office/drawing/2016/5/10/chartex" xmlns:cx5="http://schemas.microsoft.com/office/drawing/2016/5/11/chartex" xmlns:cx6="http://schemas.microsoft.com/office/drawing/2016/5/12/chartex" xmlns:cx7="http://schemas.microsoft.com/office/drawing/2016/5/13/chartex" xmlns:cx8="http://schemas.microsoft.com/office/drawing/2016/5/14/chartex" xmlns:mc="http://schemas.openxmlformats.org/markup-compatibility/2006" xmlns:aink="http://schemas.microsoft.com/office/drawing/2016/ink" xmlns:am3d="http://schemas.microsoft.com/office/drawing/2017/model3d" xmlns:o="urn:schemas-microsoft-com:office:office" xmlns:oel="http://schemas.microsoft.com/office/2019/extlst" xmlns:r="http://schemas.openxmlformats.org/officeDocument/2006/relationships" xmlns:m="http://schemas.openxmlformats.org/officeDocument/2006/math" xmlns:v="urn:schemas-microsoft-com:vml" xmlns:wp14="http://schemas.microsoft.com/office/word/2010/wordprocessingDrawing" xmlns:wp="http://schemas.openxmlformats.org/drawingml/2006/wordprocessingDrawing" xmlns:w10="urn:schemas-microsoft-com:office:word" xmlns:w="http://schemas.openxmlformats.org/wordprocessingml/2006/main" xmlns:w14="http://schemas.microsoft.com/office/word/2010/wordml" xmlns:w15="http://schemas.microsoft.com/office/word/2012/wordml" xmlns:w16cex="http://schemas.microsoft.com/office/word/2018/wordml/cex" xmlns:w16cid="http://schemas.microsoft.com/office/word/2016/wordml/cid" xmlns:w16="http://schemas.microsoft.com/office/word/2018/wordml" xmlns:w16du="http://schemas.microsoft.com/office/word/2023/wordml/word16du" xmlns:w16sdtdh="http://schemas.microsoft.com/office/word/2020/wordml/sdtdatahash" xmlns:w16sdtfl="http://schemas.microsoft.com/office/word/2024/wordml/sdtformatlock" xmlns:w16se="http://schemas.microsoft.com/office/word/2015/wordml/symex" xmlns:wpg="http://schemas.microsoft.com/office/word/2010/wordprocessingGroup" xmlns:wpi="http://schemas.microsoft.com/office/word/2010/wordprocessingInk" xmlns:wne="http://schemas.microsoft.com/office/word/2006/wordml" xmlns:wps="http://schemas.microsoft.com/office/word/2010/wordprocessingShape" mc:Ignorable="w14 w15 w16se w16cid w16 w16cex w16sdtdh w16sdtfl w16du wp14">
   <w:p>
     <w:pPr>
       <w:jc w:val="right"/>
@@ -3319,7 +3247,7 @@
 </file>
 
 <file path=word/styles.xml><?xml version="1.0" encoding="utf-8"?>
-<w:styles xmlns:mc="http://schemas.openxmlformats.org/markup-compatibility/2006" xmlns:r="http://schemas.openxmlformats.org/officeDocument/2006/relationships" xmlns:w="http://schemas.openxmlformats.org/wordprocessingml/2006/main" xmlns:w14="http://schemas.microsoft.com/office/word/2010/wordml" xmlns:w15="http://schemas.microsoft.com/office/word/2012/wordml" xmlns:w16cex="http://schemas.microsoft.com/office/word/2018/wordml/cex" xmlns:w16cid="http://schemas.microsoft.com/office/word/2016/wordml/cid" xmlns:w16="http://schemas.microsoft.com/office/word/2018/wordml" xmlns:w16sdtdh="http://schemas.microsoft.com/office/word/2020/wordml/sdtdatahash" xmlns:w16se="http://schemas.microsoft.com/office/word/2015/wordml/symex" mc:Ignorable="w14 w15 w16se w16cid w16 w16cex w16sdtdh">
+<w:styles xmlns:mc="http://schemas.openxmlformats.org/markup-compatibility/2006" xmlns:r="http://schemas.openxmlformats.org/officeDocument/2006/relationships" xmlns:w="http://schemas.openxmlformats.org/wordprocessingml/2006/main" xmlns:w14="http://schemas.microsoft.com/office/word/2010/wordml" xmlns:w15="http://schemas.microsoft.com/office/word/2012/wordml" xmlns:w16cex="http://schemas.microsoft.com/office/word/2018/wordml/cex" xmlns:w16cid="http://schemas.microsoft.com/office/word/2016/wordml/cid" xmlns:w16="http://schemas.microsoft.com/office/word/2018/wordml" xmlns:w16du="http://schemas.microsoft.com/office/word/2023/wordml/word16du" xmlns:w16sdtdh="http://schemas.microsoft.com/office/word/2020/wordml/sdtdatahash" xmlns:w16sdtfl="http://schemas.microsoft.com/office/word/2024/wordml/sdtformatlock" xmlns:w16se="http://schemas.microsoft.com/office/word/2015/wordml/symex" mc:Ignorable="w14 w15 w16se w16cid w16 w16cex w16sdtdh w16sdtfl w16du">
   <w:docDefaults>
     <w:rPrDefault>
       <w:rPr>

</xml_diff>

<commit_message>
AN - Lab3 Submitted
Finished doing lab 3 for Advanced Networks
</commit_message>
<xml_diff>
--- a/Semester 7 Fall 2026/Advanced Networks/Labs/Lab3/03_-_Subnetting.docx
+++ b/Semester 7 Fall 2026/Advanced Networks/Labs/Lab3/03_-_Subnetting.docx
@@ -118,7 +118,15 @@
         <w:ind w:left="360"/>
       </w:pPr>
       <w:r>
-        <w:t>•  Recommended router: Cisco 2911 (3 onboard GigabitEthernet ports covers the 3 departments). For the 4th interface (WAN link), power the router off, add an HWIC-1GE-SFP in an empty HWIC slot, seat a GLC-LH-SMD in its SFP cage, then power back on.</w:t>
+        <w:t xml:space="preserve">•  Recommended router: Cisco 2911 (3 onboard </w:t>
+      </w:r>
+      <w:proofErr w:type="spellStart"/>
+      <w:r>
+        <w:t>GigabitEthernet</w:t>
+      </w:r>
+      <w:proofErr w:type="spellEnd"/>
+      <w:r>
+        <w:t xml:space="preserve"> ports covers the 3 departments). For the 4th interface (WAN link), power the router off, add an HWIC-1GE-SFP in an empty HWIC slot, seat a GLC-LH-SMD in its SFP cage, then power back on.</w:t>
       </w:r>
     </w:p>
     <w:p>
@@ -1899,7 +1907,7 @@
               <w:t>12</w:t>
             </w:r>
             <w:r>
-              <w:t>1</w:t>
+              <w:t>2</w:t>
             </w:r>
           </w:p>
         </w:tc>
@@ -2084,7 +2092,11 @@
               <w:right w:val="single" w:sz="4" w:space="0" w:color="000000"/>
             </w:tcBorders>
           </w:tcPr>
-          <w:p/>
+          <w:p>
+            <w:r>
+              <w:t>192.168.10.2</w:t>
+            </w:r>
+          </w:p>
         </w:tc>
         <w:tc>
           <w:tcPr>
@@ -2096,7 +2108,11 @@
               <w:right w:val="single" w:sz="4" w:space="0" w:color="000000"/>
             </w:tcBorders>
           </w:tcPr>
-          <w:p/>
+          <w:p>
+            <w:r>
+              <w:t>255.255.255.192</w:t>
+            </w:r>
+          </w:p>
         </w:tc>
         <w:tc>
           <w:tcPr>
@@ -2108,7 +2124,11 @@
               <w:right w:val="single" w:sz="4" w:space="0" w:color="000000"/>
             </w:tcBorders>
           </w:tcPr>
-          <w:p/>
+          <w:p>
+            <w:r>
+              <w:t>192.168.10.1</w:t>
+            </w:r>
+          </w:p>
         </w:tc>
       </w:tr>
       <w:tr>
@@ -2142,7 +2162,11 @@
               <w:right w:val="single" w:sz="4" w:space="0" w:color="000000"/>
             </w:tcBorders>
           </w:tcPr>
-          <w:p/>
+          <w:p>
+            <w:r>
+              <w:t>192.168.10.3</w:t>
+            </w:r>
+          </w:p>
         </w:tc>
         <w:tc>
           <w:tcPr>
@@ -2154,7 +2178,14 @@
               <w:right w:val="single" w:sz="4" w:space="0" w:color="000000"/>
             </w:tcBorders>
           </w:tcPr>
-          <w:p/>
+          <w:p>
+            <w:r>
+              <w:t>255.255.255.</w:t>
+            </w:r>
+            <w:r>
+              <w:t>192</w:t>
+            </w:r>
+          </w:p>
         </w:tc>
         <w:tc>
           <w:tcPr>
@@ -2166,7 +2197,11 @@
               <w:right w:val="single" w:sz="4" w:space="0" w:color="000000"/>
             </w:tcBorders>
           </w:tcPr>
-          <w:p/>
+          <w:p>
+            <w:r>
+              <w:t>192.168.10.1</w:t>
+            </w:r>
+          </w:p>
         </w:tc>
       </w:tr>
       <w:tr>
@@ -2200,7 +2235,11 @@
               <w:right w:val="single" w:sz="4" w:space="0" w:color="000000"/>
             </w:tcBorders>
           </w:tcPr>
-          <w:p/>
+          <w:p>
+            <w:r>
+              <w:t>192.168.10.66</w:t>
+            </w:r>
+          </w:p>
         </w:tc>
         <w:tc>
           <w:tcPr>
@@ -2212,7 +2251,14 @@
               <w:right w:val="single" w:sz="4" w:space="0" w:color="000000"/>
             </w:tcBorders>
           </w:tcPr>
-          <w:p/>
+          <w:p>
+            <w:r>
+              <w:t>255.255.255.</w:t>
+            </w:r>
+            <w:r>
+              <w:t>224</w:t>
+            </w:r>
+          </w:p>
         </w:tc>
         <w:tc>
           <w:tcPr>
@@ -2224,7 +2270,11 @@
               <w:right w:val="single" w:sz="4" w:space="0" w:color="000000"/>
             </w:tcBorders>
           </w:tcPr>
-          <w:p/>
+          <w:p>
+            <w:r>
+              <w:t>192.168.10.65</w:t>
+            </w:r>
+          </w:p>
         </w:tc>
       </w:tr>
       <w:tr>
@@ -2258,7 +2308,11 @@
               <w:right w:val="single" w:sz="4" w:space="0" w:color="000000"/>
             </w:tcBorders>
           </w:tcPr>
-          <w:p/>
+          <w:p>
+            <w:r>
+              <w:t>192.168.10.67</w:t>
+            </w:r>
+          </w:p>
         </w:tc>
         <w:tc>
           <w:tcPr>
@@ -2270,7 +2324,14 @@
               <w:right w:val="single" w:sz="4" w:space="0" w:color="000000"/>
             </w:tcBorders>
           </w:tcPr>
-          <w:p/>
+          <w:p>
+            <w:r>
+              <w:t>255.255.255.</w:t>
+            </w:r>
+            <w:r>
+              <w:t>224</w:t>
+            </w:r>
+          </w:p>
         </w:tc>
         <w:tc>
           <w:tcPr>
@@ -2282,7 +2343,11 @@
               <w:right w:val="single" w:sz="4" w:space="0" w:color="000000"/>
             </w:tcBorders>
           </w:tcPr>
-          <w:p/>
+          <w:p>
+            <w:r>
+              <w:t>192.168.10.65</w:t>
+            </w:r>
+          </w:p>
         </w:tc>
       </w:tr>
       <w:tr>
@@ -2316,7 +2381,11 @@
               <w:right w:val="single" w:sz="4" w:space="0" w:color="000000"/>
             </w:tcBorders>
           </w:tcPr>
-          <w:p/>
+          <w:p>
+            <w:r>
+              <w:t>192.168.10.98</w:t>
+            </w:r>
+          </w:p>
         </w:tc>
         <w:tc>
           <w:tcPr>
@@ -2328,7 +2397,14 @@
               <w:right w:val="single" w:sz="4" w:space="0" w:color="000000"/>
             </w:tcBorders>
           </w:tcPr>
-          <w:p/>
+          <w:p>
+            <w:r>
+              <w:t>255.255.255.</w:t>
+            </w:r>
+            <w:r>
+              <w:t>240</w:t>
+            </w:r>
+          </w:p>
         </w:tc>
         <w:tc>
           <w:tcPr>
@@ -2340,7 +2416,11 @@
               <w:right w:val="single" w:sz="4" w:space="0" w:color="000000"/>
             </w:tcBorders>
           </w:tcPr>
-          <w:p/>
+          <w:p>
+            <w:r>
+              <w:t>192.168.10.97</w:t>
+            </w:r>
+          </w:p>
         </w:tc>
       </w:tr>
       <w:tr>
@@ -2374,7 +2454,11 @@
               <w:right w:val="single" w:sz="4" w:space="0" w:color="000000"/>
             </w:tcBorders>
           </w:tcPr>
-          <w:p/>
+          <w:p>
+            <w:r>
+              <w:t>192.168.10.99</w:t>
+            </w:r>
+          </w:p>
         </w:tc>
         <w:tc>
           <w:tcPr>
@@ -2386,7 +2470,14 @@
               <w:right w:val="single" w:sz="4" w:space="0" w:color="000000"/>
             </w:tcBorders>
           </w:tcPr>
-          <w:p/>
+          <w:p>
+            <w:r>
+              <w:t>255.255.255.</w:t>
+            </w:r>
+            <w:r>
+              <w:t>240</w:t>
+            </w:r>
+          </w:p>
         </w:tc>
         <w:tc>
           <w:tcPr>
@@ -2398,7 +2489,11 @@
               <w:right w:val="single" w:sz="4" w:space="0" w:color="000000"/>
             </w:tcBorders>
           </w:tcPr>
-          <w:p/>
+          <w:p>
+            <w:r>
+              <w:t>192.168.10.97</w:t>
+            </w:r>
+          </w:p>
         </w:tc>
       </w:tr>
       <w:tr>
@@ -2432,7 +2527,11 @@
               <w:right w:val="single" w:sz="4" w:space="0" w:color="000000"/>
             </w:tcBorders>
           </w:tcPr>
-          <w:p/>
+          <w:p>
+            <w:r>
+              <w:t>192.168.10.114</w:t>
+            </w:r>
+          </w:p>
         </w:tc>
         <w:tc>
           <w:tcPr>
@@ -2444,7 +2543,11 @@
               <w:right w:val="single" w:sz="4" w:space="0" w:color="000000"/>
             </w:tcBorders>
           </w:tcPr>
-          <w:p/>
+          <w:p>
+            <w:r>
+              <w:t>255.255.255.248</w:t>
+            </w:r>
+          </w:p>
         </w:tc>
         <w:tc>
           <w:tcPr>
@@ -2456,7 +2559,11 @@
               <w:right w:val="single" w:sz="4" w:space="0" w:color="000000"/>
             </w:tcBorders>
           </w:tcPr>
-          <w:p/>
+          <w:p>
+            <w:r>
+              <w:t>192.168.10.113</w:t>
+            </w:r>
+          </w:p>
         </w:tc>
       </w:tr>
       <w:tr>
@@ -2490,7 +2597,11 @@
               <w:right w:val="single" w:sz="4" w:space="0" w:color="000000"/>
             </w:tcBorders>
           </w:tcPr>
-          <w:p/>
+          <w:p>
+            <w:r>
+              <w:t>192.168.10.115</w:t>
+            </w:r>
+          </w:p>
         </w:tc>
         <w:tc>
           <w:tcPr>
@@ -2502,7 +2613,11 @@
               <w:right w:val="single" w:sz="4" w:space="0" w:color="000000"/>
             </w:tcBorders>
           </w:tcPr>
-          <w:p/>
+          <w:p>
+            <w:r>
+              <w:t>255.255.255.248</w:t>
+            </w:r>
+          </w:p>
         </w:tc>
         <w:tc>
           <w:tcPr>
@@ -2514,7 +2629,11 @@
               <w:right w:val="single" w:sz="4" w:space="0" w:color="000000"/>
             </w:tcBorders>
           </w:tcPr>
-          <w:p/>
+          <w:p>
+            <w:r>
+              <w:t>192.168.10.113</w:t>
+            </w:r>
+          </w:p>
         </w:tc>
       </w:tr>
     </w:tbl>
@@ -2692,7 +2811,11 @@
               <w:right w:val="single" w:sz="4" w:space="0" w:color="000000"/>
             </w:tcBorders>
           </w:tcPr>
-          <w:p/>
+          <w:p>
+            <w:r>
+              <w:t>R1</w:t>
+            </w:r>
+          </w:p>
         </w:tc>
         <w:tc>
           <w:tcPr>
@@ -2704,7 +2827,11 @@
               <w:right w:val="single" w:sz="4" w:space="0" w:color="000000"/>
             </w:tcBorders>
           </w:tcPr>
-          <w:p/>
+          <w:p>
+            <w:r>
+              <w:t>192.168.10.112</w:t>
+            </w:r>
+          </w:p>
         </w:tc>
         <w:tc>
           <w:tcPr>
@@ -2716,7 +2843,11 @@
               <w:right w:val="single" w:sz="4" w:space="0" w:color="000000"/>
             </w:tcBorders>
           </w:tcPr>
-          <w:p/>
+          <w:p>
+            <w:r>
+              <w:t>255.255.255.248</w:t>
+            </w:r>
+          </w:p>
         </w:tc>
         <w:tc>
           <w:tcPr>
@@ -2728,7 +2859,11 @@
               <w:right w:val="single" w:sz="4" w:space="0" w:color="000000"/>
             </w:tcBorders>
           </w:tcPr>
-          <w:p/>
+          <w:p>
+            <w:r>
+              <w:t>192.168.10.122</w:t>
+            </w:r>
+          </w:p>
         </w:tc>
       </w:tr>
       <w:tr>
@@ -2742,7 +2877,11 @@
               <w:right w:val="single" w:sz="4" w:space="0" w:color="000000"/>
             </w:tcBorders>
           </w:tcPr>
-          <w:p/>
+          <w:p>
+            <w:r>
+              <w:t>R2</w:t>
+            </w:r>
+          </w:p>
         </w:tc>
         <w:tc>
           <w:tcPr>
@@ -2754,7 +2893,11 @@
               <w:right w:val="single" w:sz="4" w:space="0" w:color="000000"/>
             </w:tcBorders>
           </w:tcPr>
-          <w:p/>
+          <w:p>
+            <w:r>
+              <w:t>192.168.10.0</w:t>
+            </w:r>
+          </w:p>
         </w:tc>
         <w:tc>
           <w:tcPr>
@@ -2766,7 +2909,11 @@
               <w:right w:val="single" w:sz="4" w:space="0" w:color="000000"/>
             </w:tcBorders>
           </w:tcPr>
-          <w:p/>
+          <w:p>
+            <w:r>
+              <w:t>255.255.255.192</w:t>
+            </w:r>
+          </w:p>
         </w:tc>
         <w:tc>
           <w:tcPr>
@@ -2778,7 +2925,11 @@
               <w:right w:val="single" w:sz="4" w:space="0" w:color="000000"/>
             </w:tcBorders>
           </w:tcPr>
-          <w:p/>
+          <w:p>
+            <w:r>
+              <w:t>192.168.10.121</w:t>
+            </w:r>
+          </w:p>
         </w:tc>
       </w:tr>
       <w:tr>
@@ -2792,7 +2943,11 @@
               <w:right w:val="single" w:sz="4" w:space="0" w:color="000000"/>
             </w:tcBorders>
           </w:tcPr>
-          <w:p/>
+          <w:p>
+            <w:r>
+              <w:t>R2</w:t>
+            </w:r>
+          </w:p>
         </w:tc>
         <w:tc>
           <w:tcPr>
@@ -2804,7 +2959,11 @@
               <w:right w:val="single" w:sz="4" w:space="0" w:color="000000"/>
             </w:tcBorders>
           </w:tcPr>
-          <w:p/>
+          <w:p>
+            <w:r>
+              <w:t>192.168.10.64</w:t>
+            </w:r>
+          </w:p>
         </w:tc>
         <w:tc>
           <w:tcPr>
@@ -2816,7 +2975,11 @@
               <w:right w:val="single" w:sz="4" w:space="0" w:color="000000"/>
             </w:tcBorders>
           </w:tcPr>
-          <w:p/>
+          <w:p>
+            <w:r>
+              <w:t>255.255.255.224</w:t>
+            </w:r>
+          </w:p>
         </w:tc>
         <w:tc>
           <w:tcPr>
@@ -2828,7 +2991,11 @@
               <w:right w:val="single" w:sz="4" w:space="0" w:color="000000"/>
             </w:tcBorders>
           </w:tcPr>
-          <w:p/>
+          <w:p>
+            <w:r>
+              <w:t>192.168.10.121</w:t>
+            </w:r>
+          </w:p>
         </w:tc>
       </w:tr>
       <w:tr>
@@ -2842,7 +3009,11 @@
               <w:right w:val="single" w:sz="4" w:space="0" w:color="000000"/>
             </w:tcBorders>
           </w:tcPr>
-          <w:p/>
+          <w:p>
+            <w:r>
+              <w:t>R2</w:t>
+            </w:r>
+          </w:p>
         </w:tc>
         <w:tc>
           <w:tcPr>
@@ -2854,7 +3025,11 @@
               <w:right w:val="single" w:sz="4" w:space="0" w:color="000000"/>
             </w:tcBorders>
           </w:tcPr>
-          <w:p/>
+          <w:p>
+            <w:r>
+              <w:t>192.168.10.96</w:t>
+            </w:r>
+          </w:p>
         </w:tc>
         <w:tc>
           <w:tcPr>
@@ -2866,7 +3041,11 @@
               <w:right w:val="single" w:sz="4" w:space="0" w:color="000000"/>
             </w:tcBorders>
           </w:tcPr>
-          <w:p/>
+          <w:p>
+            <w:r>
+              <w:t>255.255.255.240</w:t>
+            </w:r>
+          </w:p>
         </w:tc>
         <w:tc>
           <w:tcPr>
@@ -2878,7 +3057,11 @@
               <w:right w:val="single" w:sz="4" w:space="0" w:color="000000"/>
             </w:tcBorders>
           </w:tcPr>
-          <w:p/>
+          <w:p>
+            <w:r>
+              <w:t>192.168.10.121</w:t>
+            </w:r>
+          </w:p>
         </w:tc>
       </w:tr>
     </w:tbl>
@@ -2919,6 +3102,9 @@
         <w:spacing w:after="200"/>
       </w:pPr>
       <w:r>
+        <w:t>It allows better organization. It also allows you to optimize your networks to avoid waste. For example, it would be a waste to have a network that allows you to have 100 available hosts when you only 2</w:t>
+      </w:r>
+      <w:r>
         <w:t xml:space="preserve">                                                                                          </w:t>
       </w:r>
     </w:p>
@@ -2953,6 +3139,9 @@
         <w:spacing w:after="200"/>
       </w:pPr>
       <w:r>
+        <w:t>Because it is easier determine the amount of space needed for each subnet</w:t>
+      </w:r>
+      <w:r>
         <w:t xml:space="preserve">                                                                                          </w:t>
       </w:r>
     </w:p>
@@ -2987,6 +3176,20 @@
         <w:spacing w:after="200"/>
       </w:pPr>
       <w:r>
+        <w:t>The network address identifies the subnet itself</w:t>
+      </w:r>
+    </w:p>
+    <w:p>
+      <w:pPr>
+        <w:pBdr>
+          <w:bottom w:val="single" w:sz="4" w:space="1" w:color="999999"/>
+        </w:pBdr>
+        <w:spacing w:after="200"/>
+      </w:pPr>
+      <w:r>
+        <w:t>The broadcast address allows you to communicate with devices inside that subnet</w:t>
+      </w:r>
+      <w:r>
         <w:t xml:space="preserve">                                                                                          </w:t>
       </w:r>
     </w:p>
@@ -3021,6 +3224,9 @@
         <w:spacing w:after="200"/>
       </w:pPr>
       <w:r>
+        <w:t>Because a router already contains a routing table to point to other devices. A PC needs one in order to communicate with other devices</w:t>
+      </w:r>
+      <w:r>
         <w:t xml:space="preserve">                                                                                          </w:t>
       </w:r>
     </w:p>
@@ -3054,6 +3260,9 @@
         </w:pBdr>
         <w:spacing w:after="200"/>
       </w:pPr>
+      <w:r>
+        <w:t>Because it cannot detect it. Even if both routers are connected, they are far away from each other. To counteract this we need to hop, tell them the exact path they need to take.</w:t>
+      </w:r>
       <w:r>
         <w:t xml:space="preserve">                                                                                          </w:t>
       </w:r>

</xml_diff>